<commit_message>
fix: accurate CPU profiling, log-scale graphs, updated PPT & report
- metrics.py: calibration loop for sub-ms operations (fixes 0% CPU)
- main.py: warmup phase to eliminate cold-start artifacts
- distributed_simulation.py: same CPU fix for edge node tasks
- visualization.py: auto log-scale Y-axis + value labels on bars
- distributed_visualization.py: log-scale + annotations for all charts
- create_ppt.py: updated results, added single-node vs distributed slide
- create_report.py: updated results, added justification section
- Regenerated PPT, report, all graphs, CSV, and JSON with real data
</commit_message>
<xml_diff>
--- a/Project_Report.docx
+++ b/Project_Report.docx
@@ -975,7 +975,7 @@
               <w:rPr>
                 <w:sz w:val="20"/>
               </w:rPr>
-              <w:t>3.811</w:t>
+              <w:t>1.06</w:t>
             </w:r>
           </w:p>
         </w:tc>
@@ -988,7 +988,7 @@
               <w:rPr>
                 <w:sz w:val="20"/>
               </w:rPr>
-              <w:t>65.5</w:t>
+              <w:t>179.1</w:t>
             </w:r>
           </w:p>
         </w:tc>
@@ -1001,7 +1001,7 @@
               <w:rPr>
                 <w:sz w:val="20"/>
               </w:rPr>
-              <w:t>51.6</w:t>
+              <w:t>76.5</w:t>
             </w:r>
           </w:p>
         </w:tc>
@@ -1014,7 +1014,7 @@
               <w:rPr>
                 <w:sz w:val="20"/>
               </w:rPr>
-              <w:t>27.14</w:t>
+              <w:t>35.80</w:t>
             </w:r>
           </w:p>
         </w:tc>
@@ -1027,7 +1027,7 @@
               <w:rPr>
                 <w:sz w:val="20"/>
               </w:rPr>
-              <w:t>7.0</w:t>
+              <w:t>6.0</w:t>
             </w:r>
           </w:p>
         </w:tc>
@@ -1055,7 +1055,7 @@
               <w:rPr>
                 <w:sz w:val="20"/>
               </w:rPr>
-              <w:t>0.993</w:t>
+              <w:t>1.16</w:t>
             </w:r>
           </w:p>
         </w:tc>
@@ -1068,7 +1068,7 @@
               <w:rPr>
                 <w:sz w:val="20"/>
               </w:rPr>
-              <w:t>120.0</w:t>
+              <w:t>143.1</w:t>
             </w:r>
           </w:p>
         </w:tc>
@@ -1081,7 +1081,7 @@
               <w:rPr>
                 <w:sz w:val="20"/>
               </w:rPr>
-              <w:t>39.0</w:t>
+              <w:t>75.0</w:t>
             </w:r>
           </w:p>
         </w:tc>
@@ -1094,7 +1094,7 @@
               <w:rPr>
                 <w:sz w:val="20"/>
               </w:rPr>
-              <w:t>29.85</w:t>
+              <w:t>22.69</w:t>
             </w:r>
           </w:p>
         </w:tc>
@@ -1135,7 +1135,7 @@
               <w:rPr>
                 <w:sz w:val="20"/>
               </w:rPr>
-              <w:t>13,783.90</w:t>
+              <w:t>48,294.17</w:t>
             </w:r>
           </w:p>
         </w:tc>
@@ -1148,7 +1148,7 @@
               <w:rPr>
                 <w:sz w:val="20"/>
               </w:rPr>
-              <w:t>96.2</w:t>
+              <w:t>88.6</w:t>
             </w:r>
           </w:p>
         </w:tc>
@@ -1161,7 +1161,7 @@
               <w:rPr>
                 <w:sz w:val="20"/>
               </w:rPr>
-              <w:t>79.1</w:t>
+              <w:t>78.8</w:t>
             </w:r>
           </w:p>
         </w:tc>
@@ -1174,7 +1174,7 @@
               <w:rPr>
                 <w:sz w:val="20"/>
               </w:rPr>
-              <w:t>0.003</w:t>
+              <w:t>0.001</w:t>
             </w:r>
           </w:p>
         </w:tc>
@@ -1187,7 +1187,7 @@
               <w:rPr>
                 <w:sz w:val="20"/>
               </w:rPr>
-              <w:t>15.0</w:t>
+              <w:t>14.0</w:t>
             </w:r>
           </w:p>
         </w:tc>
@@ -1215,7 +1215,7 @@
               <w:rPr>
                 <w:sz w:val="20"/>
               </w:rPr>
-              <w:t>1,181.88</w:t>
+              <w:t>2,091.74</w:t>
             </w:r>
           </w:p>
         </w:tc>
@@ -1228,7 +1228,7 @@
               <w:rPr>
                 <w:sz w:val="20"/>
               </w:rPr>
-              <w:t>85.7</w:t>
+              <w:t>95.3</w:t>
             </w:r>
           </w:p>
         </w:tc>
@@ -1241,7 +1241,7 @@
               <w:rPr>
                 <w:sz w:val="20"/>
               </w:rPr>
-              <w:t>79.0</w:t>
+              <w:t>78.7</w:t>
             </w:r>
           </w:p>
         </w:tc>
@@ -1254,7 +1254,7 @@
               <w:rPr>
                 <w:sz w:val="20"/>
               </w:rPr>
-              <w:t>0.04</w:t>
+              <w:t>0.017</w:t>
             </w:r>
           </w:p>
         </w:tc>
@@ -1267,7 +1267,7 @@
               <w:rPr>
                 <w:sz w:val="20"/>
               </w:rPr>
-              <w:t>11.0</w:t>
+              <w:t>13.0</w:t>
             </w:r>
           </w:p>
         </w:tc>
@@ -1285,10 +1285,10 @@
         <w:rPr>
           <w:b/>
         </w:rPr>
-        <w:t xml:space="preserve">Best Overall (tied): AES-256-GCM &amp; ChaCha20-Poly1305 (Score: 7.0). </w:t>
+        <w:t xml:space="preserve">Best Overall: AES-256-GCM (Score: 6.0). </w:t>
       </w:r>
       <w:r>
-        <w:t>AES wins on CPU efficiency due to hardware AES-NI acceleration. ChaCha20 wins on throughput and memory. On devices without AES-NI (most microcontrollers), ChaCha20 is the clear winner.</w:t>
+        <w:t>AES wins on latency and throughput due to hardware AES-NI acceleration. ChaCha20 is the best choice on devices without AES-NI hardware acceleration.</w:t>
       </w:r>
     </w:p>
     <w:p>
@@ -1307,7 +1307,7 @@
         <w:t xml:space="preserve">Throughput: </w:t>
       </w:r>
       <w:r>
-        <w:t>AES and ChaCha20 achieve ~65-67 MB/s at 100KB. PRESENT and SPECK are orders of magnitude slower in pure Python.</w:t>
+        <w:t>AES achieves ~94 MB/s and ChaCha20 ~50 MB/s at 100KB. PRESENT and SPECK are orders of magnitude slower in pure Python.</w:t>
         <w:br/>
       </w:r>
       <w:r>
@@ -1317,7 +1317,7 @@
         <w:t xml:space="preserve">Encryption Time: </w:t>
       </w:r>
       <w:r>
-        <w:t>PRESENT takes ~37 seconds for 100KB. SPECK takes ~3 seconds. AES/ChaCha20 complete in under 2ms.</w:t>
+        <w:t>PRESENT takes ~127 seconds for 100KB. SPECK takes ~5.6 seconds. AES completes in ~1.2ms and ChaCha20 in ~2.1ms.</w:t>
         <w:br/>
       </w:r>
       <w:r>
@@ -1327,7 +1327,7 @@
         <w:t xml:space="preserve">CPU Usage: </w:t>
       </w:r>
       <w:r>
-        <w:t>Lightweight ciphers saturate a single CPU core (~95-100%) due to intensive bit manipulation.</w:t>
+        <w:t>All algorithms now show accurate measured CPU utilization (~88-179%) thanks to calibrated cpu_times() profiling with a calibration loop for sub-millisecond operations.</w:t>
         <w:br/>
       </w:r>
       <w:r>
@@ -1337,7 +1337,37 @@
         <w:t xml:space="preserve">Memory: </w:t>
       </w:r>
       <w:r>
-        <w:t>At 100KB, AES uses ~102KB, ChaCha20 ~100KB, PRESENT ~210KB, SPECK ~210KB peak memory.</w:t>
+        <w:t>At 100KB: AES ~202KB, ChaCha20 ~201KB, PRESENT ~211KB, SPECK ~210KB peak memory.</w:t>
+      </w:r>
+    </w:p>
+    <w:p>
+      <w:pPr>
+        <w:pStyle w:val="Heading2"/>
+      </w:pPr>
+      <w:r>
+        <w:t>Why Single-Node Benchmarking AND Distributed Simulation?</w:t>
+      </w:r>
+    </w:p>
+    <w:p>
+      <w:r>
+        <w:rPr>
+          <w:b/>
+        </w:rPr>
+        <w:t xml:space="preserve">Single-Node Benchmarking: </w:t>
+      </w:r>
+      <w:r>
+        <w:t>Establishes the performance baseline for each algorithm in isolation. Without this, distributed scalability cannot be measured. Testing across 1KB, 10KB, and 100KB payloads reveals each algorithm's setup overhead vs. processing cost curve, identifying the ideal network packet size. It also isolates exact CPU% and peak RAM per device, proving whether the algorithm is physically deployable on constrained IoT hardware.</w:t>
+        <w:br/>
+        <w:br/>
+      </w:r>
+      <w:r>
+        <w:rPr>
+          <w:b/>
+        </w:rPr>
+        <w:t xml:space="preserve">Distributed Simulation: </w:t>
+      </w:r>
+      <w:r>
+        <w:t>Real IoT deployments involve thousands of nodes encrypting concurrently. A single-node test cannot capture inter-node overhead or parallel contention. By distributing a fixed 100KB workload across N=5 to N=1000 nodes, we prove near-linear throughput scaling for AES/ChaCha20. Key finding: AES and ChaCha20 scale almost perfectly, while PRESENT and SPECK's process overhead exceeds their encryption time at high node counts.</w:t>
       </w:r>
     </w:p>
     <w:p>

</xml_diff>